<commit_message>
Digest #9: refreshed figures, and a standing order for how a digest is delivered
The digest's alignment numbers were written when the run was at 168 of 511 and
41,869 links; the run moved while the page sat. Refreshed to 171 and 41,970 in
all three renderings and the docx rebuilt from the corrected source, so the
attachment and the page agree.

The larger change is in docs/digests/README.md. "Generate the digest" now means
the whole delivery, not the markdown: build the page, build the docx, and put a
draft in the drafts folder with the docx attached — one attachment, the docx,
nothing else. Recorded there rather than carried in a head, because the part
that keeps getting dropped is the last step.
</commit_message>
<xml_diff>
--- a/docs/digests/Translation Tool - Daily Digest #9 - 20260917.docx
+++ b/docs/digests/Translation Tool - Daily Digest #9 - 20260917.docx
@@ -640,10 +640,10 @@
           <w:b/>
           <w:bCs/>
         </w:rPr>
-        <w:t xml:space="preserve">Segment 168 of 511 now</w:t>
-      </w:r>
-      <w:r>
-        <w:t xml:space="preserve">, and the first new page is done to the full</w:t>
+        <w:t xml:space="preserve">Segment 171 of 511 now</w:t>
+      </w:r>
+      <w:r>
+        <w:t xml:space="preserve">, two pages done to the full</w:t>
       </w:r>
       <w:r>
         <w:t xml:space="preserve"> </w:t>
@@ -1228,7 +1228,7 @@
               <w:pStyle w:val="Compact"/>
             </w:pPr>
             <w:r>
-              <w:t xml:space="preserve">168 of 511 segments</w:t>
+              <w:t xml:space="preserve">171 of 511 segments</w:t>
             </w:r>
           </w:p>
         </w:tc>
@@ -1252,7 +1252,7 @@
               <w:pStyle w:val="Compact"/>
             </w:pPr>
             <w:r>
-              <w:t xml:space="preserve">41,869</w:t>
+              <w:t xml:space="preserve">41,970</w:t>
             </w:r>
           </w:p>
         </w:tc>

</xml_diff>